<commit_message>
Controllo documentazione adapter e codice classAdapter
</commit_message>
<xml_diff>
--- a/designPattern/adapter/documentazione adapter oggetti.docx
+++ b/designPattern/adapter/documentazione adapter oggetti.docx
@@ -3,45 +3,44 @@
 <w:document xmlns:wpc="http://schemas.microsoft.com/office/word/2010/wordprocessingCanvas" xmlns:cx="http://schemas.microsoft.com/office/drawing/2014/chartex" xmlns:cx1="http://schemas.microsoft.com/office/drawing/2015/9/8/chartex" xmlns:cx2="http://schemas.microsoft.com/office/drawing/2015/10/21/chartex" xmlns:cx3="http://schemas.microsoft.com/office/drawing/2016/5/9/chartex" xmlns:cx4="http://schemas.microsoft.com/office/drawing/2016/5/10/chartex" xmlns:cx5="http://schemas.microsoft.com/office/drawing/2016/5/11/chartex" xmlns:cx6="http://schemas.microsoft.com/office/drawing/2016/5/12/chartex" xmlns:cx7="http://schemas.microsoft.com/office/drawing/2016/5/13/chartex" xmlns:cx8="http://schemas.microsoft.com/office/drawing/2016/5/14/chartex" xmlns:mc="http://schemas.openxmlformats.org/markup-compatibility/2006" xmlns:aink="http://schemas.microsoft.com/office/drawing/2016/ink" xmlns:am3d="http://schemas.microsoft.com/office/drawing/2017/model3d" xmlns:o="urn:schemas-microsoft-com:office:office" xmlns:oel="http://schemas.microsoft.com/office/2019/extlst" xmlns:r="http://schemas.openxmlformats.org/officeDocument/2006/relationships" xmlns:m="http://schemas.openxmlformats.org/officeDocument/2006/math" xmlns:v="urn:schemas-microsoft-com:vml" xmlns:wp14="http://schemas.microsoft.com/office/word/2010/wordprocessingDrawing" xmlns:wp="http://schemas.openxmlformats.org/drawingml/2006/wordprocessingDrawing" xmlns:w10="urn:schemas-microsoft-com:office:word" xmlns:w="http://schemas.openxmlformats.org/wordprocessingml/2006/main" xmlns:w14="http://schemas.microsoft.com/office/word/2010/wordml" xmlns:w15="http://schemas.microsoft.com/office/word/2012/wordml" xmlns:w16cex="http://schemas.microsoft.com/office/word/2018/wordml/cex" xmlns:w16cid="http://schemas.microsoft.com/office/word/2016/wordml/cid" xmlns:w16="http://schemas.microsoft.com/office/word/2018/wordml" xmlns:w16du="http://schemas.microsoft.com/office/word/2023/wordml/word16du" xmlns:w16sdtdh="http://schemas.microsoft.com/office/word/2020/wordml/sdtdatahash" xmlns:w16sdtfl="http://schemas.microsoft.com/office/word/2024/wordml/sdtformatlock" xmlns:w16se="http://schemas.microsoft.com/office/word/2015/wordml/symex" xmlns:wpg="http://schemas.microsoft.com/office/word/2010/wordprocessingGroup" xmlns:wpi="http://schemas.microsoft.com/office/word/2010/wordprocessingInk" xmlns:wne="http://schemas.microsoft.com/office/word/2006/wordml" xmlns:wps="http://schemas.microsoft.com/office/word/2010/wordprocessingShape" mc:Ignorable="w14 w15 w16se w16cid w16 w16cex w16sdtdh w16sdtfl w16du wp14">
   <w:body>
     <w:p>
-      <w:r>
-        <w:t>Il pacchetto </w:t>
-      </w:r>
-      <w:proofErr w:type="spellStart"/>
-      <w:r>
-        <w:t>adapterProfObject</w:t>
-      </w:r>
-      <w:proofErr w:type="spellEnd"/>
-      <w:r>
-        <w:t xml:space="preserve"> implementa un esempio didattico del pattern Adapter nella variante </w:t>
-      </w:r>
-      <w:proofErr w:type="spellStart"/>
-      <w:r>
-        <w:t>object</w:t>
-      </w:r>
-      <w:proofErr w:type="spellEnd"/>
-      <w:r>
-        <w:t xml:space="preserve"> </w:t>
-      </w:r>
-      <w:proofErr w:type="spellStart"/>
-      <w:r>
-        <w:t>adapter</w:t>
-      </w:r>
-      <w:proofErr w:type="spellEnd"/>
-      <w:r>
-        <w:t xml:space="preserve">, cioè quella basata sulla composizione tra oggetti invece che </w:t>
-      </w:r>
-      <w:r>
-        <w:t>sull’ereditarietà.</w:t>
-      </w:r>
-      <w:r>
-        <w:t xml:space="preserve"> In questo progetto, la classe Segreteria non estende Professore, ma contiene un oggetto Professore al suo interno e lo usa per offrire l'interfaccia richiesta dal </w:t>
-      </w:r>
-      <w:r>
-        <w:t>client.</w:t>
+      <w:pPr>
+        <w:pStyle w:val="Titolo1"/>
+      </w:pPr>
+      <w:r>
+        <w:t>ADAPTER: METODO AD OGGETTI</w:t>
       </w:r>
     </w:p>
     <w:p>
       <w:r>
+        <w:t>Il pacchetto </w:t>
+      </w:r>
+      <w:proofErr w:type="spellStart"/>
+      <w:r>
+        <w:t>adapterProfObject</w:t>
+      </w:r>
+      <w:proofErr w:type="spellEnd"/>
+      <w:r>
+        <w:t xml:space="preserve"> implementa un esempio didattico del pattern Adapter nella variante </w:t>
+      </w:r>
+      <w:proofErr w:type="spellStart"/>
+      <w:r>
+        <w:t>object</w:t>
+      </w:r>
+      <w:proofErr w:type="spellEnd"/>
+      <w:r>
+        <w:t xml:space="preserve"> </w:t>
+      </w:r>
+      <w:proofErr w:type="spellStart"/>
+      <w:r>
+        <w:t>adapter</w:t>
+      </w:r>
+      <w:proofErr w:type="spellEnd"/>
+      <w:r>
+        <w:t>, cioè quella basata sulla composizione tra oggetti invece che sull’ereditarietà. In questo progetto, la classe Segreteria non estende Professore, ma contiene un oggetto Professore al suo interno e lo usa per offrire l'interfaccia richiesta dal client.</w:t>
+      </w:r>
+    </w:p>
+    <w:p>
+      <w:r>
         <w:t>L'obiettivo del codice è permettere al client di ottenere un voto tramite il metodo </w:t>
       </w:r>
       <w:proofErr w:type="spellStart"/>
@@ -64,14 +63,11 @@
       </w:r>
       <w:proofErr w:type="spellEnd"/>
       <w:r>
-        <w:t>() .</w:t>
+        <w:t>(</w:t>
       </w:r>
       <w:proofErr w:type="gramEnd"/>
       <w:r>
-        <w:t xml:space="preserve"> Il pattern Adapter consente proprio di collegare un'interfaccia attesa dal client a una classe esistente con nomi o struttura differenti, senza dover modificare la classe </w:t>
-      </w:r>
-      <w:r>
-        <w:t>originale.</w:t>
+        <w:t>). Il pattern Adapter consente proprio di collegare un'interfaccia attesa dal client a una classe esistente con nomi o struttura differenti, senza dover modificare la classe originale.</w:t>
       </w:r>
     </w:p>
     <w:p>
@@ -175,8 +171,24 @@
           <w:numId w:val="1"/>
         </w:numPr>
       </w:pPr>
-      <w:r>
-        <w:t xml:space="preserve">Client: classe che usa </w:t>
+      <w:proofErr w:type="gramStart"/>
+      <w:r>
+        <w:t>Client</w:t>
+      </w:r>
+      <w:r>
+        <w:t>(</w:t>
+      </w:r>
+      <w:proofErr w:type="spellStart"/>
+      <w:proofErr w:type="gramEnd"/>
+      <w:r>
+        <w:t>TestAdapter</w:t>
+      </w:r>
+      <w:proofErr w:type="spellEnd"/>
+      <w:r>
+        <w:t>)</w:t>
+      </w:r>
+      <w:r>
+        <w:t xml:space="preserve">: classe che usa </w:t>
       </w:r>
       <w:proofErr w:type="spellStart"/>
       <w:r>
@@ -253,10 +265,7 @@
         <w:t>è</w:t>
       </w:r>
       <w:r>
-        <w:t xml:space="preserve"> all'interfaccia uniforme che isola il client dai dettagli interni della classe </w:t>
-      </w:r>
-      <w:r>
-        <w:t>adattata</w:t>
+        <w:t xml:space="preserve"> all'interfaccia uniforme che isola il client dai dettagli interni della classe adattata</w:t>
       </w:r>
       <w:r>
         <w:rPr>
@@ -290,23 +299,37 @@
       </w:r>
       <w:proofErr w:type="spellEnd"/>
       <w:r>
-        <w:t xml:space="preserve"> e contiene il dato private </w:t>
-      </w:r>
-      <w:proofErr w:type="spellStart"/>
-      <w:r>
-        <w:t>int</w:t>
-      </w:r>
-      <w:proofErr w:type="spellEnd"/>
-      <w:r>
-        <w:t xml:space="preserve"> voto = </w:t>
-      </w:r>
-      <w:proofErr w:type="gramStart"/>
-      <w:r>
-        <w:t>18;,</w:t>
-      </w:r>
-      <w:proofErr w:type="gramEnd"/>
-      <w:r>
-        <w:t xml:space="preserve"> insieme al metodo </w:t>
+        <w:t xml:space="preserve"> e contiene il dato private</w:t>
+      </w:r>
+      <w:r>
+        <w:t xml:space="preserve"> </w:t>
+      </w:r>
+      <w:r>
+        <w:rPr>
+          <w:i/>
+          <w:iCs/>
+        </w:rPr>
+        <w:t>“</w:t>
+      </w:r>
+      <w:r>
+        <w:rPr>
+          <w:i/>
+          <w:iCs/>
+        </w:rPr>
+        <w:t>voto</w:t>
+      </w:r>
+      <w:r>
+        <w:rPr>
+          <w:i/>
+          <w:iCs/>
+        </w:rPr>
+        <w:t>”</w:t>
+      </w:r>
+      <w:r>
+        <w:t xml:space="preserve">, </w:t>
+      </w:r>
+      <w:r>
+        <w:t>insieme al metodo </w:t>
       </w:r>
       <w:proofErr w:type="spellStart"/>
       <w:proofErr w:type="gramStart"/>
@@ -463,10 +486,7 @@
       </w:r>
       <w:proofErr w:type="spellEnd"/>
       <w:r>
-        <w:t xml:space="preserve"> delega il lavoro a un oggetto interno invece di ereditarne direttamente struttura e </w:t>
-      </w:r>
-      <w:r>
-        <w:t>comportamento</w:t>
+        <w:t xml:space="preserve"> delega il lavoro a un oggetto interno invece di ereditarne direttamente struttura e comportamento</w:t>
       </w:r>
       <w:r>
         <w:rPr>
@@ -487,10 +507,58 @@
           <w:b/>
           <w:bCs/>
         </w:rPr>
-        <w:t>Classe Client</w:t>
+        <w:br w:type="page"/>
       </w:r>
     </w:p>
     <w:p>
+      <w:pPr>
+        <w:rPr>
+          <w:b/>
+          <w:bCs/>
+        </w:rPr>
+      </w:pPr>
+      <w:r>
+        <w:rPr>
+          <w:b/>
+          <w:bCs/>
+        </w:rPr>
+        <w:lastRenderedPageBreak/>
+        <w:t>Classe </w:t>
+      </w:r>
+      <w:proofErr w:type="gramStart"/>
+      <w:r>
+        <w:rPr>
+          <w:b/>
+          <w:bCs/>
+        </w:rPr>
+        <w:t>Client</w:t>
+      </w:r>
+      <w:r>
+        <w:rPr>
+          <w:b/>
+          <w:bCs/>
+        </w:rPr>
+        <w:t>(</w:t>
+      </w:r>
+      <w:proofErr w:type="spellStart"/>
+      <w:proofErr w:type="gramEnd"/>
+      <w:r>
+        <w:rPr>
+          <w:b/>
+          <w:bCs/>
+        </w:rPr>
+        <w:t>TestAdapter</w:t>
+      </w:r>
+      <w:proofErr w:type="spellEnd"/>
+      <w:r>
+        <w:rPr>
+          <w:b/>
+          <w:bCs/>
+        </w:rPr>
+        <w:t>)</w:t>
+      </w:r>
+    </w:p>
+    <w:p>
       <w:r>
         <w:t>La classe Client crea un oggetto Segreteria e invoca </w:t>
       </w:r>
@@ -563,21 +631,13 @@
         <w:t xml:space="preserve">Professore, che resta nascosto dietro </w:t>
       </w:r>
       <w:proofErr w:type="spellStart"/>
-      <w:proofErr w:type="gramStart"/>
       <w:r>
         <w:t>l'adapter</w:t>
       </w:r>
       <w:proofErr w:type="spellEnd"/>
       <w:r>
-        <w:rPr>
-          <w:rFonts w:ascii="Aptos" w:hAnsi="Aptos" w:cs="Aptos"/>
-        </w:rPr>
-        <w:t> </w:t>
-      </w:r>
-      <w:r>
         <w:t>.</w:t>
       </w:r>
-      <w:proofErr w:type="gramEnd"/>
     </w:p>
     <w:p/>
     <w:sectPr>
@@ -1502,6 +1562,7 @@
   <w:style w:type="character" w:default="1" w:styleId="Carpredefinitoparagrafo">
     <w:name w:val="Default Paragraph Font"/>
     <w:uiPriority w:val="1"/>
+    <w:semiHidden/>
     <w:unhideWhenUsed/>
   </w:style>
   <w:style w:type="table" w:default="1" w:styleId="Tabellanormale">

</xml_diff>

<commit_message>
aggiunto txt con pattern da studiare
</commit_message>
<xml_diff>
--- a/designPattern/adapter/documentazione adapter oggetti.docx
+++ b/designPattern/adapter/documentazione adapter oggetti.docx
@@ -12,62 +12,12 @@
     </w:p>
     <w:p>
       <w:r>
-        <w:t>Il pacchetto </w:t>
-      </w:r>
-      <w:proofErr w:type="spellStart"/>
-      <w:r>
-        <w:t>adapterProfObject</w:t>
-      </w:r>
-      <w:proofErr w:type="spellEnd"/>
-      <w:r>
-        <w:t xml:space="preserve"> implementa un esempio didattico del pattern Adapter nella variante </w:t>
-      </w:r>
-      <w:proofErr w:type="spellStart"/>
-      <w:r>
-        <w:t>object</w:t>
-      </w:r>
-      <w:proofErr w:type="spellEnd"/>
-      <w:r>
-        <w:t xml:space="preserve"> </w:t>
-      </w:r>
-      <w:proofErr w:type="spellStart"/>
-      <w:r>
-        <w:t>adapter</w:t>
-      </w:r>
-      <w:proofErr w:type="spellEnd"/>
-      <w:r>
-        <w:t>, cioè quella basata sulla composizione tra oggetti invece che sull’ereditarietà. In questo progetto, la classe Segreteria non estende Professore, ma contiene un oggetto Professore al suo interno e lo usa per offrire l'interfaccia richiesta dal client.</w:t>
+        <w:t>Il pacchetto adapterProfObject implementa un esempio didattico del pattern Adapter nella variante object adapter, cioè quella basata sulla composizione tra oggetti invece che sull’ereditarietà. In questo progetto, la classe Segreteria non estende Professore, ma contiene un oggetto Professore al suo interno e lo usa per offrire l'interfaccia richiesta dal client.</w:t>
       </w:r>
     </w:p>
     <w:p>
       <w:r>
-        <w:t>L'obiettivo del codice è permettere al client di ottenere un voto tramite il metodo </w:t>
-      </w:r>
-      <w:proofErr w:type="spellStart"/>
-      <w:proofErr w:type="gramStart"/>
-      <w:r>
-        <w:t>ritiroVoto</w:t>
-      </w:r>
-      <w:proofErr w:type="spellEnd"/>
-      <w:r>
-        <w:t>(</w:t>
-      </w:r>
-      <w:proofErr w:type="gramEnd"/>
-      <w:r>
-        <w:t>), anche se la classe originale Professore espone il servizio con un metodo diverso chiamato </w:t>
-      </w:r>
-      <w:proofErr w:type="spellStart"/>
-      <w:proofErr w:type="gramStart"/>
-      <w:r>
-        <w:t>daiVoto</w:t>
-      </w:r>
-      <w:proofErr w:type="spellEnd"/>
-      <w:r>
-        <w:t>(</w:t>
-      </w:r>
-      <w:proofErr w:type="gramEnd"/>
-      <w:r>
-        <w:t>). Il pattern Adapter consente proprio di collegare un'interfaccia attesa dal client a una classe esistente con nomi o struttura differenti, senza dover modificare la classe originale.</w:t>
+        <w:t>L'obiettivo del codice è permettere al client di ottenere un voto tramite il metodo ritiroVoto(), anche se la classe originale Professore espone il servizio con un metodo diverso chiamato daiVoto(). Il pattern Adapter consente proprio di collegare un'interfaccia attesa dal client a una classe esistente con nomi o struttura differenti, senza dover modificare la classe originale.</w:t>
       </w:r>
     </w:p>
     <w:p>
@@ -103,28 +53,7 @@
         </w:numPr>
       </w:pPr>
       <w:r>
-        <w:t xml:space="preserve">Professore: </w:t>
-      </w:r>
-      <w:proofErr w:type="spellStart"/>
-      <w:r>
-        <w:t>adaptee</w:t>
-      </w:r>
-      <w:proofErr w:type="spellEnd"/>
-      <w:r>
-        <w:t>, cioè la classe esistente che fornisce il voto con il metodo </w:t>
-      </w:r>
-      <w:proofErr w:type="spellStart"/>
-      <w:proofErr w:type="gramStart"/>
-      <w:r>
-        <w:t>daiVoto</w:t>
-      </w:r>
-      <w:proofErr w:type="spellEnd"/>
-      <w:r>
-        <w:t>(</w:t>
-      </w:r>
-      <w:proofErr w:type="gramEnd"/>
-      <w:r>
-        <w:t>) </w:t>
+        <w:t>Professore: adaptee, cioè la classe esistente che fornisce il voto con il metodo daiVoto() </w:t>
       </w:r>
       <w:r>
         <w:rPr>
@@ -144,15 +73,7 @@
         </w:numPr>
       </w:pPr>
       <w:r>
-        <w:t xml:space="preserve">Segreteria: </w:t>
-      </w:r>
-      <w:proofErr w:type="spellStart"/>
-      <w:r>
-        <w:t>adapter</w:t>
-      </w:r>
-      <w:proofErr w:type="spellEnd"/>
-      <w:r>
-        <w:t>, che implementa Studente e contiene un riferimento a Professore </w:t>
+        <w:t>Segreteria: adapter, che implementa Studente e contiene un riferimento a Professore </w:t>
       </w:r>
       <w:r>
         <w:rPr>
@@ -171,32 +92,14 @@
           <w:numId w:val="1"/>
         </w:numPr>
       </w:pPr>
-      <w:proofErr w:type="gramStart"/>
       <w:r>
         <w:t>Client</w:t>
       </w:r>
       <w:r>
-        <w:t>(</w:t>
-      </w:r>
-      <w:proofErr w:type="spellStart"/>
-      <w:proofErr w:type="gramEnd"/>
-      <w:r>
-        <w:t>TestAdapter</w:t>
-      </w:r>
-      <w:proofErr w:type="spellEnd"/>
-      <w:r>
-        <w:t>)</w:t>
-      </w:r>
-      <w:r>
-        <w:t xml:space="preserve">: classe che usa </w:t>
-      </w:r>
-      <w:proofErr w:type="spellStart"/>
-      <w:r>
-        <w:t>l'adapter</w:t>
-      </w:r>
-      <w:proofErr w:type="spellEnd"/>
-      <w:r>
-        <w:t xml:space="preserve"> per ottenere il voto </w:t>
+        <w:t>(TestAdapter)</w:t>
+      </w:r>
+      <w:r>
+        <w:t>: classe che usa l'adapter per ottenere il voto </w:t>
       </w:r>
       <w:r>
         <w:rPr>
@@ -225,20 +128,7 @@
     </w:p>
     <w:p>
       <w:r>
-        <w:t>L'interfaccia Studente definisce il metodo </w:t>
-      </w:r>
-      <w:proofErr w:type="spellStart"/>
-      <w:proofErr w:type="gramStart"/>
-      <w:r>
-        <w:t>ritiroVoto</w:t>
-      </w:r>
-      <w:proofErr w:type="spellEnd"/>
-      <w:r>
-        <w:t>(</w:t>
-      </w:r>
-      <w:proofErr w:type="gramEnd"/>
-      <w:r>
-        <w:t>), che rappresenta il contratto che il client si aspetta di poter invocare </w:t>
+        <w:t>L'interfaccia Studente definisce il metodo ritiroVoto(), che rappresenta il contratto che il client si aspetta di poter invocare </w:t>
       </w:r>
       <w:r>
         <w:rPr>
@@ -291,15 +181,7 @@
     </w:p>
     <w:p>
       <w:r>
-        <w:t>La classe Professore rappresenta l'</w:t>
-      </w:r>
-      <w:proofErr w:type="spellStart"/>
-      <w:r>
-        <w:t>Adaptee</w:t>
-      </w:r>
-      <w:proofErr w:type="spellEnd"/>
-      <w:r>
-        <w:t xml:space="preserve"> e contiene il dato private</w:t>
+        <w:t>La classe Professore rappresenta l'Adaptee e contiene il dato private</w:t>
       </w:r>
       <w:r>
         <w:t xml:space="preserve"> </w:t>
@@ -329,20 +211,7 @@
         <w:t xml:space="preserve">, </w:t>
       </w:r>
       <w:r>
-        <w:t>insieme al metodo </w:t>
-      </w:r>
-      <w:proofErr w:type="spellStart"/>
-      <w:proofErr w:type="gramStart"/>
-      <w:r>
-        <w:t>daiVoto</w:t>
-      </w:r>
-      <w:proofErr w:type="spellEnd"/>
-      <w:r>
-        <w:t>(</w:t>
-      </w:r>
-      <w:proofErr w:type="gramEnd"/>
-      <w:r>
-        <w:t>) che restituisce quel valore </w:t>
+        <w:t>insieme al metodo daiVoto() che restituisce quel valore </w:t>
       </w:r>
       <w:r>
         <w:rPr>
@@ -362,7 +231,6 @@
       <w:r>
         <w:t xml:space="preserve">In questa versione il campo </w:t>
       </w:r>
-      <w:proofErr w:type="gramStart"/>
       <w:r>
         <w:rPr>
           <w:rFonts w:ascii="Aptos" w:hAnsi="Aptos" w:cs="Aptos"/>
@@ -370,11 +238,7 @@
         <w:t>è </w:t>
       </w:r>
       <w:r>
-        <w:t>private</w:t>
-      </w:r>
-      <w:proofErr w:type="gramEnd"/>
-      <w:r>
-        <w:t>, perch</w:t>
+        <w:t>private, perch</w:t>
       </w:r>
       <w:r>
         <w:rPr>
@@ -383,15 +247,7 @@
         <w:t>é</w:t>
       </w:r>
       <w:r>
-        <w:t xml:space="preserve"> </w:t>
-      </w:r>
-      <w:proofErr w:type="spellStart"/>
-      <w:r>
-        <w:t>l'adapter</w:t>
-      </w:r>
-      <w:proofErr w:type="spellEnd"/>
-      <w:r>
-        <w:t xml:space="preserve"> non deve accedere direttamente allo stato interno della classe, ma usare il metodo pubblico offerto da</w:t>
+        <w:t xml:space="preserve"> l'adapter non deve accedere direttamente allo stato interno della classe, ma usare il metodo pubblico offerto da</w:t>
       </w:r>
       <w:r>
         <w:rPr>
@@ -462,31 +318,7 @@
         <w:t> </w:t>
       </w:r>
       <w:r>
-        <w:t xml:space="preserve">Questa struttura corrisponde </w:t>
-      </w:r>
-      <w:proofErr w:type="spellStart"/>
-      <w:r>
-        <w:t>all'object</w:t>
-      </w:r>
-      <w:proofErr w:type="spellEnd"/>
-      <w:r>
-        <w:t xml:space="preserve"> </w:t>
-      </w:r>
-      <w:proofErr w:type="spellStart"/>
-      <w:r>
-        <w:t>adapter</w:t>
-      </w:r>
-      <w:proofErr w:type="spellEnd"/>
-      <w:r>
-        <w:t xml:space="preserve">, una forma del pattern Adapter in cui </w:t>
-      </w:r>
-      <w:proofErr w:type="spellStart"/>
-      <w:r>
-        <w:t>l'adapter</w:t>
-      </w:r>
-      <w:proofErr w:type="spellEnd"/>
-      <w:r>
-        <w:t xml:space="preserve"> delega il lavoro a un oggetto interno invece di ereditarne direttamente struttura e comportamento</w:t>
+        <w:t>Questa struttura corrisponde all'object adapter, una forma del pattern Adapter in cui l'adapter delega il lavoro a un oggetto interno invece di ereditarne direttamente struttura e comportamento</w:t>
       </w:r>
       <w:r>
         <w:rPr>
@@ -523,57 +355,19 @@
           <w:bCs/>
         </w:rPr>
         <w:lastRenderedPageBreak/>
-        <w:t>Classe </w:t>
-      </w:r>
-      <w:proofErr w:type="gramStart"/>
+        <w:t>Classe Client</w:t>
+      </w:r>
       <w:r>
         <w:rPr>
           <w:b/>
           <w:bCs/>
         </w:rPr>
-        <w:t>Client</w:t>
-      </w:r>
-      <w:r>
-        <w:rPr>
-          <w:b/>
-          <w:bCs/>
-        </w:rPr>
-        <w:t>(</w:t>
-      </w:r>
-      <w:proofErr w:type="spellStart"/>
-      <w:proofErr w:type="gramEnd"/>
-      <w:r>
-        <w:rPr>
-          <w:b/>
-          <w:bCs/>
-        </w:rPr>
-        <w:t>TestAdapter</w:t>
-      </w:r>
-      <w:proofErr w:type="spellEnd"/>
-      <w:r>
-        <w:rPr>
-          <w:b/>
-          <w:bCs/>
-        </w:rPr>
-        <w:t>)</w:t>
+        <w:t>(TestAdapter)</w:t>
       </w:r>
     </w:p>
     <w:p>
       <w:r>
-        <w:t>La classe Client crea un oggetto Segreteria e invoca </w:t>
-      </w:r>
-      <w:proofErr w:type="spellStart"/>
-      <w:proofErr w:type="gramStart"/>
-      <w:r>
-        <w:t>ritiroVoto</w:t>
-      </w:r>
-      <w:proofErr w:type="spellEnd"/>
-      <w:r>
-        <w:t>(</w:t>
-      </w:r>
-      <w:proofErr w:type="gramEnd"/>
-      <w:r>
-        <w:t>), stampando il risultato in output </w:t>
+        <w:t>La classe Client crea un oggetto Segreteria e invoca ritiroVoto(), stampando il risultato in output </w:t>
       </w:r>
       <w:r>
         <w:rPr>
@@ -599,18 +393,8 @@
         </w:rPr>
         <w:t> </w:t>
       </w:r>
-      <w:proofErr w:type="spellStart"/>
-      <w:proofErr w:type="gramStart"/>
-      <w:r>
-        <w:t>daiVoto</w:t>
-      </w:r>
-      <w:proofErr w:type="spellEnd"/>
-      <w:r>
-        <w:t>(</w:t>
-      </w:r>
-      <w:proofErr w:type="gramEnd"/>
-      <w:r>
-        <w:t>)</w:t>
+      <w:r>
+        <w:t>daiVoto()</w:t>
       </w:r>
       <w:r>
         <w:rPr>
@@ -628,18 +412,53 @@
         <w:t> </w:t>
       </w:r>
       <w:r>
-        <w:t xml:space="preserve">Professore, che resta nascosto dietro </w:t>
-      </w:r>
-      <w:proofErr w:type="spellStart"/>
-      <w:r>
-        <w:t>l'adapter</w:t>
-      </w:r>
-      <w:proofErr w:type="spellEnd"/>
-      <w:r>
-        <w:t>.</w:t>
+        <w:t>Professore, che resta nascosto dietro l'adapter.</w:t>
       </w:r>
     </w:p>
-    <w:p/>
+    <w:p>
+      <w:r>
+        <w:t>UML:</w:t>
+      </w:r>
+    </w:p>
+    <w:p>
+      <w:r>
+        <w:drawing>
+          <wp:inline distT="0" distB="0" distL="0" distR="0" wp14:anchorId="62BD5B4C" wp14:editId="7E29C101">
+            <wp:extent cx="6120130" cy="4048125"/>
+            <wp:effectExtent l="0" t="0" r="0" b="9525"/>
+            <wp:docPr id="1492733761" name="Immagine 1"/>
+            <wp:cNvGraphicFramePr>
+              <a:graphicFrameLocks xmlns:a="http://schemas.openxmlformats.org/drawingml/2006/main" noChangeAspect="1"/>
+            </wp:cNvGraphicFramePr>
+            <a:graphic xmlns:a="http://schemas.openxmlformats.org/drawingml/2006/main">
+              <a:graphicData uri="http://schemas.openxmlformats.org/drawingml/2006/picture">
+                <pic:pic xmlns:pic="http://schemas.openxmlformats.org/drawingml/2006/picture">
+                  <pic:nvPicPr>
+                    <pic:cNvPr id="1492733761" name=""/>
+                    <pic:cNvPicPr/>
+                  </pic:nvPicPr>
+                  <pic:blipFill>
+                    <a:blip r:embed="rId5"/>
+                    <a:stretch>
+                      <a:fillRect/>
+                    </a:stretch>
+                  </pic:blipFill>
+                  <pic:spPr>
+                    <a:xfrm>
+                      <a:off x="0" y="0"/>
+                      <a:ext cx="6120130" cy="4048125"/>
+                    </a:xfrm>
+                    <a:prstGeom prst="rect">
+                      <a:avLst/>
+                    </a:prstGeom>
+                  </pic:spPr>
+                </pic:pic>
+              </a:graphicData>
+            </a:graphic>
+          </wp:inline>
+        </w:drawing>
+      </w:r>
+    </w:p>
     <w:sectPr>
       <w:pgSz w:w="11906" w:h="16838"/>
       <w:pgMar w:top="1417" w:right="1134" w:bottom="1134" w:left="1134" w:header="708" w:footer="708" w:gutter="0"/>

</xml_diff>